<commit_message>
Auto-save: 2 file(s) — 2026-10-20 13:15
</commit_message>
<xml_diff>
--- a/Notes/2026-10-20-xloop-large-language-models-page-content-v1.docx
+++ b/Notes/2026-10-20-xloop-large-language-models-page-content-v1.docx
@@ -4785,18 +4785,7 @@
           <w:sz w:val="21"/>
           <w:szCs w:val="21"/>
         </w:rPr>
-        <w:t xml:space="preserve">Yes. Leading models handle many languages well. We test performance in your languages on your own content, and adapt prompts or fine tune where quality falls short. </w:t>
-      </w:r>
-      <w:r>
-        <w:rPr>
-          <w:rFonts w:ascii="Arial" w:cs="Arial" w:eastAsia="Arial" w:hAnsi="Arial"/>
-          <w:b/>
-          <w:bCs/>
-          <w:color w:val="B45309"/>
-          <w:sz w:val="21"/>
-          <w:szCs w:val="21"/>
-        </w:rPr>
-        <w:t xml:space="preserve">[CONFIRM: languages delivered on client work, for example Urdu or Arabic]</w:t>
+        <w:t xml:space="preserve">Yes. Leading models handle many languages well, and xServe, our AI ordering product, works in English, Urdu and Arabic. For your use case, we test performance in your languages on your own content, and adapt prompts or fine tune where quality falls short.</w:t>
       </w:r>
     </w:p>
     <w:p>

</xml_diff>